<commit_message>
Add USC credentials analyst résumé
</commit_message>
<xml_diff>
--- a/assets/Erik_Yeghinyan_Resume.docx
+++ b/assets/Erik_Yeghinyan_Resume.docx
@@ -4,6 +4,7 @@
   <w:body>
     <w:p>
       <w:pPr>
+        <w:pStyle w:val="ResumeTitle"/>
         <w:spacing w:after="20"/>
         <w:jc w:val="center"/>
       </w:pPr>
@@ -11,8 +12,8 @@
         <w:rPr>
           <w:rFonts w:ascii="Arial" w:hAnsi="Arial"/>
           <w:b/>
-          <w:color w:val="161616"/>
-          <w:sz w:val="37"/>
+          <w:color w:val="000000"/>
+          <w:sz w:val="38"/>
         </w:rPr>
         <w:t>ERIK YEGHINYAN</w:t>
       </w:r>
@@ -26,10 +27,10 @@
         <w:rPr>
           <w:rFonts w:ascii="Arial" w:hAnsi="Arial"/>
           <w:b/>
-          <w:color w:val="B41E2D"/>
-          <w:sz w:val="23"/>
+          <w:color w:val="991B1E"/>
+          <w:sz w:val="21"/>
         </w:rPr>
-        <w:t>TELLER</w:t>
+        <w:t>GRADUATE AND INTERNATIONAL CREDENTIALS ANALYST</w:t>
       </w:r>
     </w:p>
     <w:p>
@@ -41,7 +42,7 @@
         <w:rPr>
           <w:rFonts w:ascii="Arial" w:hAnsi="Arial"/>
           <w:b w:val="0"/>
-          <w:color w:val="525252"/>
+          <w:color w:val="4B4B4B"/>
           <w:sz w:val="17"/>
         </w:rPr>
         <w:t>Los Angeles, CA  |  508-815-9050  |  eyeghinyan@gmail.com  |  linkedin.com/in/erik-yeghinyan</w:t>
@@ -56,10 +57,10 @@
         <w:rPr>
           <w:rFonts w:ascii="Arial" w:hAnsi="Arial"/>
           <w:b w:val="0"/>
-          <w:color w:val="525252"/>
+          <w:color w:val="4B4B4B"/>
           <w:sz w:val="16"/>
         </w:rPr>
-        <w:t>Authorized to work in the United States without sponsorship  |  Available Saturdays</w:t>
+        <w:t>Authorized to work in the United States without sponsorship</w:t>
       </w:r>
     </w:p>
     <w:p>
@@ -70,10 +71,10 @@
         <w:rPr>
           <w:rFonts w:ascii="Arial" w:hAnsi="Arial"/>
           <w:b/>
-          <w:color w:val="B41E2D"/>
+          <w:color w:val="000000"/>
           <w:sz w:val="19"/>
         </w:rPr>
-        <w:t>PROFESSIONAL SUMMARY</w:t>
+        <w:t>PROFESSIONAL PROFILE</w:t>
       </w:r>
     </w:p>
     <w:p>
@@ -84,10 +85,10 @@
         <w:rPr>
           <w:rFonts w:ascii="Arial" w:hAnsi="Arial"/>
           <w:b w:val="0"/>
-          <w:color w:val="161616"/>
+          <w:color w:val="000000"/>
           <w:sz w:val="18"/>
         </w:rPr>
-        <w:t>Customer-focused teller and banking professional with direct experience processing deposits, withdrawals, transfers, payments, and other routine service transactions in a fast-paced branch. Known for accurate cash handling, active listening, clear digital-banking education, referral identification, and timely resolution of customer concerns. Applies sound judgment, follows operational and regulatory controls, recognizes potential risk, and escalates complex situations appropriately. Multilingual in English, Armenian, and Russian.</w:t>
+        <w:t>Internationally educated higher-education research, records, and compliance professional with direct experience supporting a university-focused digital credential platform. Skilled in researching institutions and education systems, validating complex records, interpreting written requirements, resolving discrepancies, documenting defensible decisions, and communicating clearly with people from diverse cultural and linguistic backgrounds. Prepared to support graduate and international credential review, policy application, applicant guidance, academic-department coordination, and outreach with accuracy, sound judgment, and respect for confidentiality.</w:t>
       </w:r>
     </w:p>
     <w:p>
@@ -98,10 +99,10 @@
         <w:rPr>
           <w:rFonts w:ascii="Arial" w:hAnsi="Arial"/>
           <w:b/>
-          <w:color w:val="B41E2D"/>
+          <w:color w:val="000000"/>
           <w:sz w:val="19"/>
         </w:rPr>
-        <w:t>CORE QUALIFICATIONS</w:t>
+        <w:t>USC ROLE ALIGNMENT</w:t>
       </w:r>
     </w:p>
     <w:p>
@@ -112,10 +113,10 @@
         <w:rPr>
           <w:rFonts w:ascii="Arial" w:hAnsi="Arial"/>
           <w:b w:val="0"/>
-          <w:color w:val="161616"/>
+          <w:color w:val="000000"/>
           <w:sz w:val="17"/>
         </w:rPr>
-        <w:t>Customer Transactions  •  Deposits and Withdrawals  •  Payments and Check Cashing  •  Cash Drawer Balancing  •  Customer Needs Assessment  •  Active Listening  •  Digital and Mobile Banking Education  •  Self-Service Options  •  Referral Identification  •  Customer Concern Resolution  •  Branch Operations  •  Multiple-System Processing  •  Fraud and Risk Recognition  •  Policy and Control Compliance  •  Team Collaboration</w:t>
+        <w:t>International Credential Research  •  Academic Record and Document Review  •  Domestic and Foreign Institution Research  •  Qualitative Record Assessment  •  Policy and Procedure Interpretation  •  Data Validation and Integrity  •  Discrepancy Resolution  •  Confidential Records  •  Applicant and Student Communication  •  Cross-Cultural Advising  •  Academic Department Coordination  •  Outreach and Follow-Up  •  CRM and Reporting  •  Microsoft Office and Excel</w:t>
       </w:r>
     </w:p>
     <w:p>
@@ -126,10 +127,10 @@
         <w:rPr>
           <w:rFonts w:ascii="Arial" w:hAnsi="Arial"/>
           <w:b/>
-          <w:color w:val="B41E2D"/>
+          <w:color w:val="000000"/>
           <w:sz w:val="19"/>
         </w:rPr>
-        <w:t>RELEVANT EXPERIENCE</w:t>
+        <w:t>CREDENTIALS AND RECORDS EXPERIENCE</w:t>
       </w:r>
     </w:p>
     <w:p>
@@ -140,16 +141,535 @@
         <w:rPr>
           <w:rFonts w:ascii="Arial" w:hAnsi="Arial"/>
           <w:b/>
-          <w:color w:val="161616"/>
+          <w:color w:val="000000"/>
           <w:sz w:val="19"/>
         </w:rPr>
-        <w:t>Teller and Relationship Banker</w:t>
+        <w:t>Lead Research Specialist</w:t>
       </w:r>
       <w:r>
         <w:rPr>
           <w:rFonts w:ascii="Arial" w:hAnsi="Arial"/>
           <w:b/>
-          <w:color w:val="B41E2D"/>
+          <w:color w:val="991B1E"/>
+          <w:sz w:val="19"/>
+        </w:rPr>
+        <w:t xml:space="preserve">  |  DiplomaSafe</w:t>
+      </w:r>
+      <w:r>
+        <w:rPr>
+          <w:rFonts w:ascii="Arial" w:hAnsi="Arial"/>
+          <w:b/>
+          <w:color w:val="4B4B4B"/>
+          <w:sz w:val="18"/>
+        </w:rPr>
+        <w:t xml:space="preserve">  |  Oct 2023 – May 2024</w:t>
+      </w:r>
+    </w:p>
+    <w:p>
+      <w:pPr>
+        <w:spacing w:after="16"/>
+      </w:pPr>
+      <w:r>
+        <w:rPr>
+          <w:rFonts w:ascii="Arial" w:hAnsi="Arial"/>
+          <w:b w:val="0"/>
+          <w:color w:val="4B4B4B"/>
+          <w:sz w:val="17"/>
+        </w:rPr>
+        <w:t>Lithuania | Remote</w:t>
+      </w:r>
+    </w:p>
+    <w:p>
+      <w:pPr>
+        <w:spacing w:after="34"/>
+        <w:ind w:left="259" w:hanging="202"/>
+      </w:pPr>
+      <w:r>
+        <w:rPr>
+          <w:rFonts w:ascii="Arial" w:hAnsi="Arial"/>
+          <w:b w:val="0"/>
+          <w:color w:val="000000"/>
+          <w:sz w:val="18"/>
+        </w:rPr>
+        <w:t>•  Researched universities, colleges, credential-issuing institutions, academic departments, and education-system information for a platform supporting secure, verifiable digital diplomas, certificates, and badges.</w:t>
+      </w:r>
+    </w:p>
+    <w:p>
+      <w:pPr>
+        <w:spacing w:after="34"/>
+        <w:ind w:left="259" w:hanging="202"/>
+      </w:pPr>
+      <w:r>
+        <w:rPr>
+          <w:rFonts w:ascii="Arial" w:hAnsi="Arial"/>
+          <w:b w:val="0"/>
+          <w:color w:val="000000"/>
+          <w:sz w:val="18"/>
+        </w:rPr>
+        <w:t>•  Validated institution names, locations, official websites, contacts, programs, and credential-related information before creating or updating records in CRM and research systems.</w:t>
+      </w:r>
+    </w:p>
+    <w:p>
+      <w:pPr>
+        <w:spacing w:after="34"/>
+        <w:ind w:left="259" w:hanging="202"/>
+      </w:pPr>
+      <w:r>
+        <w:rPr>
+          <w:rFonts w:ascii="Arial" w:hAnsi="Arial"/>
+          <w:b w:val="0"/>
+          <w:color w:val="000000"/>
+          <w:sz w:val="18"/>
+        </w:rPr>
+        <w:t>•  Compared authoritative sources to resolve incomplete or inconsistent institutional information and maintained traceable documentation supporting accurate internal decisions.</w:t>
+      </w:r>
+    </w:p>
+    <w:p>
+      <w:pPr>
+        <w:spacing w:after="34"/>
+        <w:ind w:left="259" w:hanging="202"/>
+      </w:pPr>
+      <w:r>
+        <w:rPr>
+          <w:rFonts w:ascii="Arial" w:hAnsi="Arial"/>
+          <w:b w:val="0"/>
+          <w:color w:val="000000"/>
+          <w:sz w:val="18"/>
+        </w:rPr>
+        <w:t>•  Prepared structured reports on credential practices and institutional needs, enabling outreach teams to prioritize universities and communicate with the appropriate departments.</w:t>
+      </w:r>
+    </w:p>
+    <w:p>
+      <w:pPr>
+        <w:spacing w:before="70" w:after="0"/>
+      </w:pPr>
+      <w:r>
+        <w:rPr>
+          <w:rFonts w:ascii="Arial" w:hAnsi="Arial"/>
+          <w:b/>
+          <w:color w:val="000000"/>
+          <w:sz w:val="19"/>
+        </w:rPr>
+        <w:t>Research Assistant</w:t>
+      </w:r>
+      <w:r>
+        <w:rPr>
+          <w:rFonts w:ascii="Arial" w:hAnsi="Arial"/>
+          <w:b/>
+          <w:color w:val="991B1E"/>
+          <w:sz w:val="19"/>
+        </w:rPr>
+        <w:t xml:space="preserve">  |  Gausus Gyvenimas</w:t>
+      </w:r>
+      <w:r>
+        <w:rPr>
+          <w:rFonts w:ascii="Arial" w:hAnsi="Arial"/>
+          <w:b/>
+          <w:color w:val="4B4B4B"/>
+          <w:sz w:val="18"/>
+        </w:rPr>
+        <w:t xml:space="preserve">  |  Sep 2022 – Apr 2023</w:t>
+      </w:r>
+    </w:p>
+    <w:p>
+      <w:pPr>
+        <w:spacing w:after="16"/>
+      </w:pPr>
+      <w:r>
+        <w:rPr>
+          <w:rFonts w:ascii="Arial" w:hAnsi="Arial"/>
+          <w:b w:val="0"/>
+          <w:color w:val="4B4B4B"/>
+          <w:sz w:val="17"/>
+        </w:rPr>
+        <w:t>Klaipėda, Lithuania | Hybrid</w:t>
+      </w:r>
+    </w:p>
+    <w:p>
+      <w:pPr>
+        <w:spacing w:after="34"/>
+        <w:ind w:left="259" w:hanging="202"/>
+      </w:pPr>
+      <w:r>
+        <w:rPr>
+          <w:rFonts w:ascii="Arial" w:hAnsi="Arial"/>
+          <w:b w:val="0"/>
+          <w:color w:val="000000"/>
+          <w:sz w:val="18"/>
+        </w:rPr>
+        <w:t>•  Interpreted European education, Erasmus+, youth-development, and funding requirements and converted complex source material into clear application and project documentation.</w:t>
+      </w:r>
+    </w:p>
+    <w:p>
+      <w:pPr>
+        <w:spacing w:after="34"/>
+        <w:ind w:left="259" w:hanging="202"/>
+      </w:pPr>
+      <w:r>
+        <w:rPr>
+          <w:rFonts w:ascii="Arial" w:hAnsi="Arial"/>
+          <w:b w:val="0"/>
+          <w:color w:val="000000"/>
+          <w:sz w:val="18"/>
+        </w:rPr>
+        <w:t>•  Prepared and quality-checked proposals, eligibility information, and supporting records, contributing to two funded projects and five international initiatives.</w:t>
+      </w:r>
+    </w:p>
+    <w:p>
+      <w:pPr>
+        <w:spacing w:after="34"/>
+        <w:ind w:left="259" w:hanging="202"/>
+      </w:pPr>
+      <w:r>
+        <w:rPr>
+          <w:rFonts w:ascii="Arial" w:hAnsi="Arial"/>
+          <w:b w:val="0"/>
+          <w:color w:val="000000"/>
+          <w:sz w:val="18"/>
+        </w:rPr>
+        <w:t>•  Coordinated requirements, deadlines, records, and follow-up across international partners while maintaining accurate written documentation.</w:t>
+      </w:r>
+    </w:p>
+    <w:p>
+      <w:pPr>
+        <w:spacing w:before="70" w:after="0"/>
+      </w:pPr>
+      <w:r>
+        <w:rPr>
+          <w:rFonts w:ascii="Arial" w:hAnsi="Arial"/>
+          <w:b/>
+          <w:color w:val="000000"/>
+          <w:sz w:val="19"/>
+        </w:rPr>
+        <w:t>Compliance Analyst</w:t>
+      </w:r>
+      <w:r>
+        <w:rPr>
+          <w:rFonts w:ascii="Arial" w:hAnsi="Arial"/>
+          <w:b/>
+          <w:color w:val="991B1E"/>
+          <w:sz w:val="19"/>
+        </w:rPr>
+        <w:t xml:space="preserve">  |  Guidehouse supporting Green Dot Bank</w:t>
+      </w:r>
+      <w:r>
+        <w:rPr>
+          <w:rFonts w:ascii="Arial" w:hAnsi="Arial"/>
+          <w:b/>
+          <w:color w:val="4B4B4B"/>
+          <w:sz w:val="18"/>
+        </w:rPr>
+        <w:t xml:space="preserve">  |  Sep 2024 – May 2025</w:t>
+      </w:r>
+    </w:p>
+    <w:p>
+      <w:pPr>
+        <w:spacing w:after="16"/>
+      </w:pPr>
+      <w:r>
+        <w:rPr>
+          <w:rFonts w:ascii="Arial" w:hAnsi="Arial"/>
+          <w:b w:val="0"/>
+          <w:color w:val="4B4B4B"/>
+          <w:sz w:val="17"/>
+        </w:rPr>
+        <w:t>Vilnius, Lithuania | Hybrid</w:t>
+      </w:r>
+    </w:p>
+    <w:p>
+      <w:pPr>
+        <w:spacing w:after="34"/>
+        <w:ind w:left="259" w:hanging="202"/>
+      </w:pPr>
+      <w:r>
+        <w:rPr>
+          <w:rFonts w:ascii="Arial" w:hAnsi="Arial"/>
+          <w:b w:val="0"/>
+          <w:color w:val="000000"/>
+          <w:sz w:val="18"/>
+        </w:rPr>
+        <w:t>•  Reviewed 30 or more customer accounts, identity information, payment activity, and supporting records daily for completeness, consistency, and policy-based compliance concerns.</w:t>
+      </w:r>
+    </w:p>
+    <w:p>
+      <w:pPr>
+        <w:spacing w:after="34"/>
+        <w:ind w:left="259" w:hanging="202"/>
+      </w:pPr>
+      <w:r>
+        <w:rPr>
+          <w:rFonts w:ascii="Arial" w:hAnsi="Arial"/>
+          <w:b w:val="0"/>
+          <w:color w:val="000000"/>
+          <w:sz w:val="18"/>
+        </w:rPr>
+        <w:t>•  Analyzed information against customer profiles and written requirements, documented clear review outcomes, and escalated discrepancies or higher-risk matters for additional assessment.</w:t>
+      </w:r>
+    </w:p>
+    <w:p>
+      <w:pPr>
+        <w:spacing w:after="34"/>
+        <w:ind w:left="259" w:hanging="202"/>
+      </w:pPr>
+      <w:r>
+        <w:rPr>
+          <w:rFonts w:ascii="Arial" w:hAnsi="Arial"/>
+          <w:b w:val="0"/>
+          <w:color w:val="000000"/>
+          <w:sz w:val="18"/>
+        </w:rPr>
+        <w:t>•  Used Unit21, World-Check, OSINT, and Excel while meeting service and quality expectations and maintaining confidential, audit-ready case documentation.</w:t>
+      </w:r>
+    </w:p>
+    <w:p>
+      <w:r>
+        <w:br w:type="page"/>
+      </w:r>
+    </w:p>
+    <w:p>
+      <w:pPr>
+        <w:spacing w:after="0"/>
+        <w:jc w:val="center"/>
+      </w:pPr>
+      <w:r>
+        <w:rPr>
+          <w:rFonts w:ascii="Arial" w:hAnsi="Arial"/>
+          <w:b/>
+          <w:color w:val="000000"/>
+          <w:sz w:val="24"/>
+        </w:rPr>
+        <w:t>ERIK YEGHINYAN</w:t>
+      </w:r>
+    </w:p>
+    <w:p>
+      <w:pPr>
+        <w:spacing w:after="60"/>
+        <w:jc w:val="center"/>
+      </w:pPr>
+      <w:r>
+        <w:rPr>
+          <w:rFonts w:ascii="Arial" w:hAnsi="Arial"/>
+          <w:b/>
+          <w:color w:val="991B1E"/>
+          <w:sz w:val="19"/>
+        </w:rPr>
+        <w:t>GRADUATE AND INTERNATIONAL CREDENTIALS ANALYST</w:t>
+      </w:r>
+    </w:p>
+    <w:p>
+      <w:pPr>
+        <w:spacing w:before="100" w:after="50"/>
+      </w:pPr>
+      <w:r>
+        <w:rPr>
+          <w:rFonts w:ascii="Arial" w:hAnsi="Arial"/>
+          <w:b/>
+          <w:color w:val="000000"/>
+          <w:sz w:val="19"/>
+        </w:rPr>
+        <w:t>ADDITIONAL RELEVANT EXPERIENCE</w:t>
+      </w:r>
+    </w:p>
+    <w:p>
+      <w:pPr>
+        <w:spacing w:before="70" w:after="0"/>
+      </w:pPr>
+      <w:r>
+        <w:rPr>
+          <w:rFonts w:ascii="Arial" w:hAnsi="Arial"/>
+          <w:b/>
+          <w:color w:val="000000"/>
+          <w:sz w:val="19"/>
+        </w:rPr>
+        <w:t>Compliance Operations Specialist</w:t>
+      </w:r>
+      <w:r>
+        <w:rPr>
+          <w:rFonts w:ascii="Arial" w:hAnsi="Arial"/>
+          <w:b/>
+          <w:color w:val="991B1E"/>
+          <w:sz w:val="19"/>
+        </w:rPr>
+        <w:t xml:space="preserve">  |  IDBank</w:t>
+      </w:r>
+      <w:r>
+        <w:rPr>
+          <w:rFonts w:ascii="Arial" w:hAnsi="Arial"/>
+          <w:b/>
+          <w:color w:val="4B4B4B"/>
+          <w:sz w:val="18"/>
+        </w:rPr>
+        <w:t xml:space="preserve">  |  Sep 2023 – Sep 2024</w:t>
+      </w:r>
+    </w:p>
+    <w:p>
+      <w:pPr>
+        <w:spacing w:after="16"/>
+      </w:pPr>
+      <w:r>
+        <w:rPr>
+          <w:rFonts w:ascii="Arial" w:hAnsi="Arial"/>
+          <w:b w:val="0"/>
+          <w:color w:val="4B4B4B"/>
+          <w:sz w:val="17"/>
+        </w:rPr>
+        <w:t>Yerevan, Armenia | Remote</w:t>
+      </w:r>
+    </w:p>
+    <w:p>
+      <w:pPr>
+        <w:spacing w:after="34"/>
+        <w:ind w:left="259" w:hanging="202"/>
+      </w:pPr>
+      <w:r>
+        <w:rPr>
+          <w:rFonts w:ascii="Arial" w:hAnsi="Arial"/>
+          <w:b w:val="0"/>
+          <w:color w:val="000000"/>
+          <w:sz w:val="18"/>
+        </w:rPr>
+        <w:t>•  Reviewed identity and supporting documents for completeness, consistency, and alignment with established onboarding and verification requirements.</w:t>
+      </w:r>
+    </w:p>
+    <w:p>
+      <w:pPr>
+        <w:spacing w:after="34"/>
+        <w:ind w:left="259" w:hanging="202"/>
+      </w:pPr>
+      <w:r>
+        <w:rPr>
+          <w:rFonts w:ascii="Arial" w:hAnsi="Arial"/>
+          <w:b w:val="0"/>
+          <w:color w:val="000000"/>
+          <w:sz w:val="18"/>
+        </w:rPr>
+        <w:t>•  Resolved documentation discrepancies, updated customer profiles, and maintained accurate electronic records across multiple internal systems.</w:t>
+      </w:r>
+    </w:p>
+    <w:p>
+      <w:pPr>
+        <w:spacing w:after="34"/>
+        <w:ind w:left="259" w:hanging="202"/>
+      </w:pPr>
+      <w:r>
+        <w:rPr>
+          <w:rFonts w:ascii="Arial" w:hAnsi="Arial"/>
+          <w:b w:val="0"/>
+          <w:color w:val="000000"/>
+          <w:sz w:val="18"/>
+        </w:rPr>
+        <w:t>•  Applied written procedures consistently, documented decisions, and coordinated cases requiring clarification or additional review.</w:t>
+      </w:r>
+    </w:p>
+    <w:p>
+      <w:pPr>
+        <w:spacing w:before="70" w:after="0"/>
+      </w:pPr>
+      <w:r>
+        <w:rPr>
+          <w:rFonts w:ascii="Arial" w:hAnsi="Arial"/>
+          <w:b/>
+          <w:color w:val="000000"/>
+          <w:sz w:val="19"/>
+        </w:rPr>
+        <w:t>Multilingual Customer Service Representative and Interpreter</w:t>
+      </w:r>
+      <w:r>
+        <w:rPr>
+          <w:rFonts w:ascii="Arial" w:hAnsi="Arial"/>
+          <w:b/>
+          <w:color w:val="991B1E"/>
+          <w:sz w:val="19"/>
+        </w:rPr>
+        <w:t xml:space="preserve">  |  Teleperformance</w:t>
+      </w:r>
+      <w:r>
+        <w:rPr>
+          <w:rFonts w:ascii="Arial" w:hAnsi="Arial"/>
+          <w:b/>
+          <w:color w:val="4B4B4B"/>
+          <w:sz w:val="18"/>
+        </w:rPr>
+        <w:t xml:space="preserve">  |  Sep 2023 – Sep 2024</w:t>
+      </w:r>
+    </w:p>
+    <w:p>
+      <w:pPr>
+        <w:spacing w:after="16"/>
+      </w:pPr>
+      <w:r>
+        <w:rPr>
+          <w:rFonts w:ascii="Arial" w:hAnsi="Arial"/>
+          <w:b w:val="0"/>
+          <w:color w:val="4B4B4B"/>
+          <w:sz w:val="17"/>
+        </w:rPr>
+        <w:t>Lithuania | Remote</w:t>
+      </w:r>
+    </w:p>
+    <w:p>
+      <w:pPr>
+        <w:spacing w:after="34"/>
+        <w:ind w:left="259" w:hanging="202"/>
+      </w:pPr>
+      <w:r>
+        <w:rPr>
+          <w:rFonts w:ascii="Arial" w:hAnsi="Arial"/>
+          <w:b w:val="0"/>
+          <w:color w:val="000000"/>
+          <w:sz w:val="18"/>
+        </w:rPr>
+        <w:t>•  Interpreted complex information in English, Armenian, and Russian for people from diverse backgrounds in healthcare, legal, and government settings.</w:t>
+      </w:r>
+    </w:p>
+    <w:p>
+      <w:pPr>
+        <w:spacing w:after="34"/>
+        <w:ind w:left="259" w:hanging="202"/>
+      </w:pPr>
+      <w:r>
+        <w:rPr>
+          <w:rFonts w:ascii="Arial" w:hAnsi="Arial"/>
+          <w:b w:val="0"/>
+          <w:color w:val="000000"/>
+          <w:sz w:val="18"/>
+        </w:rPr>
+        <w:t>•  Used careful listening and clarifying questions to explain requirements, processes, and next steps accurately and respectfully.</w:t>
+      </w:r>
+    </w:p>
+    <w:p>
+      <w:pPr>
+        <w:spacing w:after="34"/>
+        <w:ind w:left="259" w:hanging="202"/>
+      </w:pPr>
+      <w:r>
+        <w:rPr>
+          <w:rFonts w:ascii="Arial" w:hAnsi="Arial"/>
+          <w:b w:val="0"/>
+          <w:color w:val="000000"/>
+          <w:sz w:val="18"/>
+        </w:rPr>
+        <w:t>•  Protected confidential information, documented interactions, and escalated matters when records or circumstances required specialized review.</w:t>
+      </w:r>
+    </w:p>
+    <w:p>
+      <w:pPr>
+        <w:spacing w:before="70" w:after="0"/>
+      </w:pPr>
+      <w:r>
+        <w:rPr>
+          <w:rFonts w:ascii="Arial" w:hAnsi="Arial"/>
+          <w:b/>
+          <w:color w:val="000000"/>
+          <w:sz w:val="19"/>
+        </w:rPr>
+        <w:t>Bank Teller and Relationship Banker</w:t>
+      </w:r>
+      <w:r>
+        <w:rPr>
+          <w:rFonts w:ascii="Arial" w:hAnsi="Arial"/>
+          <w:b/>
+          <w:color w:val="991B1E"/>
           <w:sz w:val="19"/>
         </w:rPr>
         <w:t xml:space="preserve">  |  Santander Bank USA</w:t>
@@ -158,7 +678,7 @@
         <w:rPr>
           <w:rFonts w:ascii="Arial" w:hAnsi="Arial"/>
           <w:b/>
-          <w:color w:val="525252"/>
+          <w:color w:val="4B4B4B"/>
           <w:sz w:val="18"/>
         </w:rPr>
         <w:t xml:space="preserve">  |  May 2026 – Sep 2026</w:t>
@@ -166,13 +686,13 @@
     </w:p>
     <w:p>
       <w:pPr>
-        <w:spacing w:after="20"/>
+        <w:spacing w:after="16"/>
       </w:pPr>
       <w:r>
         <w:rPr>
           <w:rFonts w:ascii="Arial" w:hAnsi="Arial"/>
           <w:b w:val="0"/>
-          <w:color w:val="525252"/>
+          <w:color w:val="4B4B4B"/>
           <w:sz w:val="17"/>
         </w:rPr>
         <w:t>Hyannis, Massachusetts</w:t>
@@ -187,10 +707,10 @@
         <w:rPr>
           <w:rFonts w:ascii="Arial" w:hAnsi="Arial"/>
           <w:b w:val="0"/>
-          <w:color w:val="161616"/>
+          <w:color w:val="000000"/>
           <w:sz w:val="18"/>
         </w:rPr>
-        <w:t>•  Processed up to 40 daily deposits, withdrawals, transfers, card and loan payments, check-cashing requests, and other routine transactions accurately across branch systems.</w:t>
+        <w:t>•  Processed up to 40 daily deposits, withdrawals, transfers, payments, check-cashing requests, and account-service transactions accurately across branch systems.</w:t>
       </w:r>
     </w:p>
     <w:p>
@@ -202,10 +722,10 @@
         <w:rPr>
           <w:rFonts w:ascii="Arial" w:hAnsi="Arial"/>
           <w:b w:val="0"/>
-          <w:color w:val="161616"/>
+          <w:color w:val="000000"/>
           <w:sz w:val="18"/>
         </w:rPr>
-        <w:t>•  Balanced the cash drawer, verified customer identities, followed dual-control and cash-handling procedures, and escalated fraud, KYC, BSA, and unusual-activity concerns to protect customers and the bank.</w:t>
+        <w:t>•  Verified identities and transaction documentation, balanced cash, followed bank controls, and escalated fraud, KYC, BSA, and unusual-activity concerns.</w:t>
       </w:r>
     </w:p>
     <w:p>
@@ -217,42 +737,24 @@
         <w:rPr>
           <w:rFonts w:ascii="Arial" w:hAnsi="Arial"/>
           <w:b w:val="0"/>
-          <w:color w:val="161616"/>
+          <w:color w:val="000000"/>
           <w:sz w:val="18"/>
         </w:rPr>
-        <w:t>•  Welcomed customers, listened for everyday financial needs, explained mobile, online, ATM, and self-service options, and connected customers to bankers for detailed product guidance; earned 10 out of 10 survey results and district recognition.</w:t>
+        <w:t>•  Explained account information and next steps to customers from diverse backgrounds, resolved routine concerns, and earned 10 out of 10 survey results and district recognition.</w:t>
       </w:r>
     </w:p>
     <w:p>
       <w:pPr>
-        <w:spacing w:before="70" w:after="0"/>
+        <w:spacing w:before="100" w:after="50"/>
       </w:pPr>
       <w:r>
         <w:rPr>
           <w:rFonts w:ascii="Arial" w:hAnsi="Arial"/>
           <w:b/>
-          <w:color w:val="161616"/>
+          <w:color w:val="000000"/>
           <w:sz w:val="19"/>
         </w:rPr>
-        <w:t>Sales Associate</w:t>
-      </w:r>
-      <w:r>
-        <w:rPr>
-          <w:rFonts w:ascii="Arial" w:hAnsi="Arial"/>
-          <w:b/>
-          <w:color w:val="B41E2D"/>
-          <w:sz w:val="19"/>
-        </w:rPr>
-        <w:t xml:space="preserve">  |  7-Eleven</w:t>
-      </w:r>
-      <w:r>
-        <w:rPr>
-          <w:rFonts w:ascii="Arial" w:hAnsi="Arial"/>
-          <w:b/>
-          <w:color w:val="525252"/>
-          <w:sz w:val="18"/>
-        </w:rPr>
-        <w:t xml:space="preserve">  |  Sep 2025 – May 2026</w:t>
+        <w:t>EDUCATION AND INTERNATIONAL ENGAGEMENT</w:t>
       </w:r>
     </w:p>
     <w:p>
@@ -262,11 +764,20 @@
       <w:r>
         <w:rPr>
           <w:rFonts w:ascii="Arial" w:hAnsi="Arial"/>
+          <w:b/>
+          <w:color w:val="000000"/>
+          <w:sz w:val="18"/>
+        </w:rPr>
+        <w:t>Bachelor of Arts in Contemporary Communication</w:t>
+      </w:r>
+      <w:r>
+        <w:rPr>
+          <w:rFonts w:ascii="Arial" w:hAnsi="Arial"/>
           <w:b w:val="0"/>
-          <w:color w:val="525252"/>
-          <w:sz w:val="17"/>
+          <w:color w:val="4B4B4B"/>
+          <w:sz w:val="18"/>
         </w:rPr>
-        <w:t>Glendale, California</w:t>
+        <w:t xml:space="preserve">  |  LCC International University, Lithuania  |  2024</w:t>
       </w:r>
     </w:p>
     <w:p>
@@ -278,10 +789,10 @@
         <w:rPr>
           <w:rFonts w:ascii="Arial" w:hAnsi="Arial"/>
           <w:b w:val="0"/>
-          <w:color w:val="161616"/>
+          <w:color w:val="000000"/>
           <w:sz w:val="18"/>
         </w:rPr>
-        <w:t>•  Processed high-volume cash, card, and digital-wallet transactions with close attention to accuracy while maintaining a welcoming, reliable customer experience.</w:t>
+        <w:t>•  Completed an English-language degree in an international university environment; GPA 8.57 out of 10.</w:t>
       </w:r>
     </w:p>
     <w:p>
@@ -293,409 +804,10 @@
         <w:rPr>
           <w:rFonts w:ascii="Arial" w:hAnsi="Arial"/>
           <w:b w:val="0"/>
-          <w:color w:val="161616"/>
+          <w:color w:val="000000"/>
           <w:sz w:val="18"/>
         </w:rPr>
-        <w:t>•  Resolved routine payment, refund, mobile-app, and promotion questions using clear explanations and sound judgment, escalating complex concerns when additional support was required.</w:t>
-      </w:r>
-    </w:p>
-    <w:p>
-      <w:pPr>
-        <w:spacing w:after="34"/>
-        <w:ind w:left="259" w:hanging="202"/>
-      </w:pPr>
-      <w:r>
-        <w:rPr>
-          <w:rFonts w:ascii="Arial" w:hAnsi="Arial"/>
-          <w:b w:val="0"/>
-          <w:color w:val="161616"/>
-          <w:sz w:val="18"/>
-        </w:rPr>
-        <w:t>•  Reconciled registers, maintained accurate shift records, prioritized customers during peak traffic, and followed fraud-awareness, safety, and loss-prevention controls.</w:t>
-      </w:r>
-    </w:p>
-    <w:p>
-      <w:pPr>
-        <w:spacing w:before="70" w:after="0"/>
-      </w:pPr>
-      <w:r>
-        <w:rPr>
-          <w:rFonts w:ascii="Arial" w:hAnsi="Arial"/>
-          <w:b/>
-          <w:color w:val="161616"/>
-          <w:sz w:val="19"/>
-        </w:rPr>
-        <w:t>AML Compliance Analyst</w:t>
-      </w:r>
-      <w:r>
-        <w:rPr>
-          <w:rFonts w:ascii="Arial" w:hAnsi="Arial"/>
-          <w:b/>
-          <w:color w:val="B41E2D"/>
-          <w:sz w:val="19"/>
-        </w:rPr>
-        <w:t xml:space="preserve">  |  Green Dot Bank</w:t>
-      </w:r>
-      <w:r>
-        <w:rPr>
-          <w:rFonts w:ascii="Arial" w:hAnsi="Arial"/>
-          <w:b/>
-          <w:color w:val="525252"/>
-          <w:sz w:val="18"/>
-        </w:rPr>
-        <w:t xml:space="preserve">  |  Sep 2024 – May 2025</w:t>
-      </w:r>
-    </w:p>
-    <w:p>
-      <w:pPr>
-        <w:spacing w:after="20"/>
-      </w:pPr>
-      <w:r>
-        <w:rPr>
-          <w:rFonts w:ascii="Arial" w:hAnsi="Arial"/>
-          <w:b w:val="0"/>
-          <w:color w:val="525252"/>
-          <w:sz w:val="17"/>
-        </w:rPr>
-        <w:t>Vilnius, Lithuania | Hybrid</w:t>
-      </w:r>
-    </w:p>
-    <w:p>
-      <w:pPr>
-        <w:spacing w:after="34"/>
-        <w:ind w:left="259" w:hanging="202"/>
-      </w:pPr>
-      <w:r>
-        <w:rPr>
-          <w:rFonts w:ascii="Arial" w:hAnsi="Arial"/>
-          <w:b w:val="0"/>
-          <w:color w:val="161616"/>
-          <w:sz w:val="18"/>
-        </w:rPr>
-        <w:t>•  Reviewed 30+ customer accounts and payment alerts daily involving ACH, peer-to-peer transfers, account-takeover indicators, identity concerns, and unusual transaction activity.</w:t>
-      </w:r>
-    </w:p>
-    <w:p>
-      <w:pPr>
-        <w:spacing w:after="34"/>
-        <w:ind w:left="259" w:hanging="202"/>
-      </w:pPr>
-      <w:r>
-        <w:rPr>
-          <w:rFonts w:ascii="Arial" w:hAnsi="Arial"/>
-          <w:b w:val="0"/>
-          <w:color w:val="161616"/>
-          <w:sz w:val="18"/>
-        </w:rPr>
-        <w:t>•  Compared transaction behavior with customer profiles, documented clear decisions, and escalated higher-risk activity in line with established policies, controls, service levels, and regulatory requirements.</w:t>
-      </w:r>
-    </w:p>
-    <w:p>
-      <w:pPr>
-        <w:spacing w:after="34"/>
-        <w:ind w:left="259" w:hanging="202"/>
-      </w:pPr>
-      <w:r>
-        <w:rPr>
-          <w:rFonts w:ascii="Arial" w:hAnsi="Arial"/>
-          <w:b w:val="0"/>
-          <w:color w:val="161616"/>
-          <w:sz w:val="18"/>
-        </w:rPr>
-        <w:t>•  Used Unit21, World-Check, OSINT, and Excel while meeting quality expectations; improved review efficiency by approximately 25% and helped reduce avoidable false-positive escalations by approximately 30%.</w:t>
-      </w:r>
-    </w:p>
-    <w:p>
-      <w:pPr>
-        <w:spacing w:before="70" w:after="0"/>
-      </w:pPr>
-      <w:r>
-        <w:rPr>
-          <w:rFonts w:ascii="Arial" w:hAnsi="Arial"/>
-          <w:b/>
-          <w:color w:val="161616"/>
-          <w:sz w:val="19"/>
-        </w:rPr>
-        <w:t>Compliance Operations Specialist</w:t>
-      </w:r>
-      <w:r>
-        <w:rPr>
-          <w:rFonts w:ascii="Arial" w:hAnsi="Arial"/>
-          <w:b/>
-          <w:color w:val="B41E2D"/>
-          <w:sz w:val="19"/>
-        </w:rPr>
-        <w:t xml:space="preserve">  |  IDBank</w:t>
-      </w:r>
-      <w:r>
-        <w:rPr>
-          <w:rFonts w:ascii="Arial" w:hAnsi="Arial"/>
-          <w:b/>
-          <w:color w:val="525252"/>
-          <w:sz w:val="18"/>
-        </w:rPr>
-        <w:t xml:space="preserve">  |  Sep 2023 – Sep 2024</w:t>
-      </w:r>
-    </w:p>
-    <w:p>
-      <w:pPr>
-        <w:spacing w:after="20"/>
-      </w:pPr>
-      <w:r>
-        <w:rPr>
-          <w:rFonts w:ascii="Arial" w:hAnsi="Arial"/>
-          <w:b w:val="0"/>
-          <w:color w:val="525252"/>
-          <w:sz w:val="17"/>
-        </w:rPr>
-        <w:t>Yerevan, Armenia | Remote</w:t>
-      </w:r>
-    </w:p>
-    <w:p>
-      <w:pPr>
-        <w:spacing w:after="34"/>
-        <w:ind w:left="259" w:hanging="202"/>
-      </w:pPr>
-      <w:r>
-        <w:rPr>
-          <w:rFonts w:ascii="Arial" w:hAnsi="Arial"/>
-          <w:b w:val="0"/>
-          <w:color w:val="161616"/>
-          <w:sz w:val="18"/>
-        </w:rPr>
-        <w:t>•  Supported digital customer onboarding, identity verification, account-opening controls, account servicing, and fraud-prevention reviews in a regulated banking environment.</w:t>
-      </w:r>
-    </w:p>
-    <w:p>
-      <w:pPr>
-        <w:spacing w:after="34"/>
-        <w:ind w:left="259" w:hanging="202"/>
-      </w:pPr>
-      <w:r>
-        <w:rPr>
-          <w:rFonts w:ascii="Arial" w:hAnsi="Arial"/>
-          <w:b w:val="0"/>
-          <w:color w:val="161616"/>
-          <w:sz w:val="18"/>
-        </w:rPr>
-        <w:t>•  Resolved documentation discrepancies, updated customer risk profiles, maintained accurate records across multiple systems, and communicated simple next steps to customer-facing partners.</w:t>
-      </w:r>
-    </w:p>
-    <w:p>
-      <w:pPr>
-        <w:spacing w:after="34"/>
-        <w:ind w:left="259" w:hanging="202"/>
-      </w:pPr>
-      <w:r>
-        <w:rPr>
-          <w:rFonts w:ascii="Arial" w:hAnsi="Arial"/>
-          <w:b w:val="0"/>
-          <w:color w:val="161616"/>
-          <w:sz w:val="18"/>
-        </w:rPr>
-        <w:t>•  Prioritized time-sensitive cases, followed established procedures, and escalated higher-risk concerns within required service, quality, and compliance timeframes.</w:t>
-      </w:r>
-    </w:p>
-    <w:p>
-      <w:r>
-        <w:br w:type="page"/>
-      </w:r>
-    </w:p>
-    <w:p>
-      <w:pPr>
-        <w:spacing w:after="80"/>
-        <w:jc w:val="center"/>
-      </w:pPr>
-      <w:r>
-        <w:rPr>
-          <w:rFonts w:ascii="Arial" w:hAnsi="Arial"/>
-          <w:b/>
-          <w:color w:val="161616"/>
-          <w:sz w:val="20"/>
-        </w:rPr>
-        <w:t>ERIK YEGHINYAN  |  TELLER</w:t>
-      </w:r>
-    </w:p>
-    <w:p>
-      <w:pPr>
-        <w:spacing w:before="70" w:after="0"/>
-      </w:pPr>
-      <w:r>
-        <w:rPr>
-          <w:rFonts w:ascii="Arial" w:hAnsi="Arial"/>
-          <w:b/>
-          <w:color w:val="161616"/>
-          <w:sz w:val="19"/>
-        </w:rPr>
-        <w:t>Multilingual Customer Service Representative and Interpreter</w:t>
-      </w:r>
-      <w:r>
-        <w:rPr>
-          <w:rFonts w:ascii="Arial" w:hAnsi="Arial"/>
-          <w:b/>
-          <w:color w:val="B41E2D"/>
-          <w:sz w:val="19"/>
-        </w:rPr>
-        <w:t xml:space="preserve">  |  Teleperformance</w:t>
-      </w:r>
-      <w:r>
-        <w:rPr>
-          <w:rFonts w:ascii="Arial" w:hAnsi="Arial"/>
-          <w:b/>
-          <w:color w:val="525252"/>
-          <w:sz w:val="18"/>
-        </w:rPr>
-        <w:t xml:space="preserve">  |  Sep 2023 – Sep 2024</w:t>
-      </w:r>
-    </w:p>
-    <w:p>
-      <w:pPr>
-        <w:spacing w:after="20"/>
-      </w:pPr>
-      <w:r>
-        <w:rPr>
-          <w:rFonts w:ascii="Arial" w:hAnsi="Arial"/>
-          <w:b w:val="0"/>
-          <w:color w:val="525252"/>
-          <w:sz w:val="17"/>
-        </w:rPr>
-        <w:t>Lithuania | Remote</w:t>
-      </w:r>
-    </w:p>
-    <w:p>
-      <w:pPr>
-        <w:spacing w:after="34"/>
-        <w:ind w:left="259" w:hanging="202"/>
-      </w:pPr>
-      <w:r>
-        <w:rPr>
-          <w:rFonts w:ascii="Arial" w:hAnsi="Arial"/>
-          <w:b w:val="0"/>
-          <w:color w:val="161616"/>
-          <w:sz w:val="18"/>
-        </w:rPr>
-        <w:t>•  Handled high-volume English, Armenian, and Russian customer interactions across sensitive healthcare, legal, and government service environments.</w:t>
-      </w:r>
-    </w:p>
-    <w:p>
-      <w:pPr>
-        <w:spacing w:after="34"/>
-        <w:ind w:left="259" w:hanging="202"/>
-      </w:pPr>
-      <w:r>
-        <w:rPr>
-          <w:rFonts w:ascii="Arial" w:hAnsi="Arial"/>
-          <w:b w:val="0"/>
-          <w:color w:val="161616"/>
-          <w:sz w:val="18"/>
-        </w:rPr>
-        <w:t>•  Used active listening and effective questions to clarify needs, explain information accurately, resolve routine concerns, and provide clear next steps.</w:t>
-      </w:r>
-    </w:p>
-    <w:p>
-      <w:pPr>
-        <w:spacing w:after="34"/>
-        <w:ind w:left="259" w:hanging="202"/>
-      </w:pPr>
-      <w:r>
-        <w:rPr>
-          <w:rFonts w:ascii="Arial" w:hAnsi="Arial"/>
-          <w:b w:val="0"/>
-          <w:color w:val="161616"/>
-          <w:sz w:val="18"/>
-        </w:rPr>
-        <w:t>•  Protected confidential information, documented interactions accurately, adapted quickly between systems and situations, and escalated complex issues appropriately.</w:t>
-      </w:r>
-    </w:p>
-    <w:p>
-      <w:pPr>
-        <w:spacing w:before="70" w:after="0"/>
-      </w:pPr>
-      <w:r>
-        <w:rPr>
-          <w:rFonts w:ascii="Arial" w:hAnsi="Arial"/>
-          <w:b/>
-          <w:color w:val="161616"/>
-          <w:sz w:val="19"/>
-        </w:rPr>
-        <w:t>Sales Representative</w:t>
-      </w:r>
-      <w:r>
-        <w:rPr>
-          <w:rFonts w:ascii="Arial" w:hAnsi="Arial"/>
-          <w:b/>
-          <w:color w:val="B41E2D"/>
-          <w:sz w:val="19"/>
-        </w:rPr>
-        <w:t xml:space="preserve">  |  BTalk</w:t>
-      </w:r>
-      <w:r>
-        <w:rPr>
-          <w:rFonts w:ascii="Arial" w:hAnsi="Arial"/>
-          <w:b/>
-          <w:color w:val="525252"/>
-          <w:sz w:val="18"/>
-        </w:rPr>
-        <w:t xml:space="preserve">  |  Contract</w:t>
-      </w:r>
-    </w:p>
-    <w:p>
-      <w:pPr>
-        <w:spacing w:after="20"/>
-      </w:pPr>
-      <w:r>
-        <w:rPr>
-          <w:rFonts w:ascii="Arial" w:hAnsi="Arial"/>
-          <w:b w:val="0"/>
-          <w:color w:val="525252"/>
-          <w:sz w:val="17"/>
-        </w:rPr>
-        <w:t>United States | Contract</w:t>
-      </w:r>
-    </w:p>
-    <w:p>
-      <w:pPr>
-        <w:spacing w:after="34"/>
-        <w:ind w:left="259" w:hanging="202"/>
-      </w:pPr>
-      <w:r>
-        <w:rPr>
-          <w:rFonts w:ascii="Arial" w:hAnsi="Arial"/>
-          <w:b w:val="0"/>
-          <w:color w:val="161616"/>
-          <w:sz w:val="18"/>
-        </w:rPr>
-        <w:t>•  Engaged U.S. schools and institutions through outbound calls and emails, identified purchasing needs, and introduced relevant Armenian-language book offerings.</w:t>
-      </w:r>
-    </w:p>
-    <w:p>
-      <w:pPr>
-        <w:spacing w:after="34"/>
-        <w:ind w:left="259" w:hanging="202"/>
-      </w:pPr>
-      <w:r>
-        <w:rPr>
-          <w:rFonts w:ascii="Arial" w:hAnsi="Arial"/>
-          <w:b w:val="0"/>
-          <w:color w:val="161616"/>
-          <w:sz w:val="18"/>
-        </w:rPr>
-        <w:t>•  Maintained accurate prospect, customer, and follow-up records in CRM systems and prioritized outreach in a dynamic customer-focused environment.</w:t>
-      </w:r>
-    </w:p>
-    <w:p>
-      <w:pPr>
-        <w:spacing w:after="34"/>
-        <w:ind w:left="259" w:hanging="202"/>
-      </w:pPr>
-      <w:r>
-        <w:rPr>
-          <w:rFonts w:ascii="Arial" w:hAnsi="Arial"/>
-          <w:b w:val="0"/>
-          <w:color w:val="161616"/>
-          <w:sz w:val="18"/>
-        </w:rPr>
-        <w:t>•  Built trust through professional communication, responsive service, clear product explanations, and consistent follow-through on customer questions and next steps.</w:t>
+        <w:t>•  Participated in and led more than 20 Erasmus+ exchanges involving European institutions, education programs, cultures, and international participants.</w:t>
       </w:r>
     </w:p>
     <w:p>
@@ -706,69 +818,10 @@
         <w:rPr>
           <w:rFonts w:ascii="Arial" w:hAnsi="Arial"/>
           <w:b/>
-          <w:color w:val="B41E2D"/>
+          <w:color w:val="000000"/>
           <w:sz w:val="19"/>
         </w:rPr>
-        <w:t>SELECTED PERFORMANCE</w:t>
-      </w:r>
-    </w:p>
-    <w:p>
-      <w:pPr>
-        <w:spacing w:after="34"/>
-        <w:ind w:left="259" w:hanging="202"/>
-      </w:pPr>
-      <w:r>
-        <w:rPr>
-          <w:rFonts w:ascii="Arial" w:hAnsi="Arial"/>
-          <w:b w:val="0"/>
-          <w:color w:val="161616"/>
-          <w:sz w:val="18"/>
-        </w:rPr>
-        <w:t>•  Customer Experience: Earned 10 out of 10 customer survey results and district recognition for service in retail banking.</w:t>
-      </w:r>
-    </w:p>
-    <w:p>
-      <w:pPr>
-        <w:spacing w:after="34"/>
-        <w:ind w:left="259" w:hanging="202"/>
-      </w:pPr>
-      <w:r>
-        <w:rPr>
-          <w:rFonts w:ascii="Arial" w:hAnsi="Arial"/>
-          <w:b w:val="0"/>
-          <w:color w:val="161616"/>
-          <w:sz w:val="18"/>
-        </w:rPr>
-        <w:t>•  Transaction Accuracy: Processed up to 40 daily banking transactions while maintaining cash accountability and control compliance.</w:t>
-      </w:r>
-    </w:p>
-    <w:p>
-      <w:pPr>
-        <w:spacing w:after="34"/>
-        <w:ind w:left="259" w:hanging="202"/>
-      </w:pPr>
-      <w:r>
-        <w:rPr>
-          <w:rFonts w:ascii="Arial" w:hAnsi="Arial"/>
-          <w:b w:val="0"/>
-          <w:color w:val="161616"/>
-          <w:sz w:val="18"/>
-        </w:rPr>
-        <w:t>•  Risk Awareness: Applied fraud, KYC, BSA, identity-verification, and escalation procedures across frontline and operational banking roles.</w:t>
-      </w:r>
-    </w:p>
-    <w:p>
-      <w:pPr>
-        <w:spacing w:before="100" w:after="50"/>
-      </w:pPr>
-      <w:r>
-        <w:rPr>
-          <w:rFonts w:ascii="Arial" w:hAnsi="Arial"/>
-          <w:b/>
-          <w:color w:val="B41E2D"/>
-          <w:sz w:val="19"/>
-        </w:rPr>
-        <w:t>EDUCATION AND PROFESSIONAL DEVELOPMENT</w:t>
+        <w:t>LANGUAGES AND SYSTEMS</w:t>
       </w:r>
     </w:p>
     <w:p>
@@ -779,56 +832,19 @@
         <w:rPr>
           <w:rFonts w:ascii="Arial" w:hAnsi="Arial"/>
           <w:b/>
-          <w:color w:val="161616"/>
+          <w:color w:val="000000"/>
           <w:sz w:val="18"/>
         </w:rPr>
-        <w:t>Bachelor of Arts in Contemporary Communication</w:t>
+        <w:t xml:space="preserve">Languages: </w:t>
       </w:r>
       <w:r>
         <w:rPr>
           <w:rFonts w:ascii="Arial" w:hAnsi="Arial"/>
           <w:b w:val="0"/>
-          <w:color w:val="525252"/>
+          <w:color w:val="000000"/>
           <w:sz w:val="18"/>
         </w:rPr>
-        <w:t xml:space="preserve">  |  LCC International University, Lithuania  |  2024</w:t>
-      </w:r>
-    </w:p>
-    <w:p>
-      <w:pPr>
-        <w:spacing w:after="20"/>
-      </w:pPr>
-      <w:r>
-        <w:rPr>
-          <w:rFonts w:ascii="Arial" w:hAnsi="Arial"/>
-          <w:b/>
-          <w:color w:val="161616"/>
-          <w:sz w:val="18"/>
-        </w:rPr>
-        <w:t>ACAMS Anti-Money Laundering Training</w:t>
-      </w:r>
-      <w:r>
-        <w:rPr>
-          <w:rFonts w:ascii="Arial" w:hAnsi="Arial"/>
-          <w:b w:val="0"/>
-          <w:color w:val="525252"/>
-          <w:sz w:val="17"/>
-        </w:rPr>
-        <w:t xml:space="preserve">  |  AML, OFAC, KYC, CDD, transaction monitoring, and financial-crime compliance</w:t>
-      </w:r>
-    </w:p>
-    <w:p>
-      <w:pPr>
-        <w:spacing w:before="100" w:after="50"/>
-      </w:pPr>
-      <w:r>
-        <w:rPr>
-          <w:rFonts w:ascii="Arial" w:hAnsi="Arial"/>
-          <w:b/>
-          <w:color w:val="B41E2D"/>
-          <w:sz w:val="19"/>
-        </w:rPr>
-        <w:t>TECHNOLOGY AND LANGUAGES</w:t>
+        <w:t>Armenian (Native), English (Fluent/C2), Russian (Advanced)</w:t>
       </w:r>
     </w:p>
     <w:p>
@@ -839,47 +855,24 @@
         <w:rPr>
           <w:rFonts w:ascii="Arial" w:hAnsi="Arial"/>
           <w:b/>
-          <w:color w:val="161616"/>
+          <w:color w:val="000000"/>
           <w:sz w:val="18"/>
         </w:rPr>
-        <w:t xml:space="preserve">Technology: </w:t>
+        <w:t xml:space="preserve">Systems: </w:t>
       </w:r>
       <w:r>
         <w:rPr>
           <w:rFonts w:ascii="Arial" w:hAnsi="Arial"/>
           <w:b w:val="0"/>
-          <w:color w:val="161616"/>
-          <w:sz w:val="17"/>
-        </w:rPr>
-        <w:t>Digital banking platforms, Unit21, World-Check, Microsoft Office, Excel, Google Workspace, Salesforce, HubSpot, and CRM systems</w:t>
-      </w:r>
-    </w:p>
-    <w:p>
-      <w:pPr>
-        <w:spacing w:after="0"/>
-      </w:pPr>
-      <w:r>
-        <w:rPr>
-          <w:rFonts w:ascii="Arial" w:hAnsi="Arial"/>
-          <w:b/>
-          <w:color w:val="161616"/>
+          <w:color w:val="000000"/>
           <w:sz w:val="18"/>
         </w:rPr>
-        <w:t xml:space="preserve">Languages: </w:t>
-      </w:r>
-      <w:r>
-        <w:rPr>
-          <w:rFonts w:ascii="Arial" w:hAnsi="Arial"/>
-          <w:b w:val="0"/>
-          <w:color w:val="161616"/>
-          <w:sz w:val="17"/>
-        </w:rPr>
-        <w:t>Armenian (Native), English (Fluent), Russian (Advanced)</w:t>
+        <w:t>Microsoft Office, Excel, Google Workspace, CRM systems, Salesforce, HubSpot, Unit21, World-Check, OSINT, online research, data validation, and reporting</w:t>
       </w:r>
     </w:p>
     <w:sectPr>
       <w:pgSz w:w="12240" w:h="15840"/>
-      <w:pgMar w:top="720" w:right="936" w:bottom="691" w:left="936" w:header="720" w:footer="720" w:gutter="0"/>
+      <w:pgMar w:top="749" w:right="979" w:bottom="691" w:left="979" w:header="720" w:footer="720" w:gutter="0"/>
       <w:cols w:space="720"/>
       <w:docGrid w:linePitch="360"/>
     </w:sectPr>
@@ -1255,7 +1248,7 @@
     </w:pPr>
     <w:rPr>
       <w:rFonts w:ascii="Arial" w:hAnsi="Arial"/>
-      <w:color w:val="161616"/>
+      <w:color w:val="000000"/>
       <w:sz w:val="18"/>
     </w:rPr>
   </w:style>
@@ -12940,6 +12933,18 @@
         <w:shd w:val="clear" w:color="auto" w:fill="FBCAA2" w:themeFill="accent6" w:themeFillTint="7F"/>
       </w:tcPr>
     </w:tblStylePr>
+  </w:style>
+  <w:style w:type="paragraph" w:customStyle="1" w:styleId="ResumeTitle">
+    <w:name w:val="Resume Title"/>
+    <w:pPr>
+      <w:spacing w:after="20"/>
+    </w:pPr>
+    <w:rPr>
+      <w:rFonts w:ascii="Arial" w:hAnsi="Arial"/>
+      <w:b/>
+      <w:color w:val="000000"/>
+      <w:sz w:val="38"/>
+    </w:rPr>
   </w:style>
 </w:styles>
 </file>

</xml_diff>